<commit_message>
FMS: fix non-clickable NABH citation URL
Converted the NABH citation link in all 7 FMS files from plain text
containing a URL into a real clickable OOXML hyperlink.

Co-Authored-By: Claude Sonnet 5 <noreply@anthropic.com>
Claude-Session: https://claude.ai/code/session_016VFLsECWt4VArpBiaqgrgF
</commit_message>
<xml_diff>
--- a/policies/build/chapters_v2/FMS/document/FMS_Package_v2/FMS1/SOP_FMS1_safe_and_secure_environment.docx
+++ b/policies/build/chapters_v2/FMS/document/FMS_Package_v2/FMS1/SOP_FMS1_safe_and_secure_environment.docx
@@ -711,12 +711,15 @@
       <w:pPr>
         <w:pStyle w:val="ListParagraph"/>
       </w:pPr>
-      <w:r>
-        <w:rPr>
-          <w:i/>
-        </w:rPr>
-        <w:t>National Accreditation Board for Hospitals and Healthcare Providers. (2025). NABH accreditation standards for hospitals (6th ed.), FMS.1. ISBN 978-81-965264-9-8. https://portal.nabh.co/images/Standards/NABH%20Hospital%20Accreditation%20Standard%206th%20Edition%20January%202025.pdf</w:t>
-      </w:r>
+      <w:hyperlink r:id="rId12">
+        <w:r>
+          <w:rPr>
+            <w:rStyle w:val="Hyperlink"/>
+            <w:i/>
+          </w:rPr>
+          <w:t>National Accreditation Board for Hospitals and Healthcare Providers. (2025). NABH accreditation standards for hospitals (6th ed.), FMS.1. ISBN 978-81-965264-9-8. https://portal.nabh.co/images/Standards/NABH%20Hospital%20Accreditation%20Standard%206th%20Edition%20January%202025.pdf</w:t>
+        </w:r>
+      </w:hyperlink>
     </w:p>
     <w:p>
       <w:pPr>

</xml_diff>